<commit_message>
docs: apply PLOS ONE technical-check fixes (v1.0.13)
- Continuous line numbers + page-number footer + double spacing in manuscript
- Table 11 result file: multi_all_ds.json -> multi_smote_ds.json
- Consolidate S1/S2/S3 captions under end-of-manuscript Supporting information
- Add S3 body citation in Sec 3.7; fix S1/S2 phantom section refs (S8/S7.3 -> S6.1/S6.2/S3.7)
- Fix S1/S2 header manuscript filename (paper_final.md/v5 -> paper_en_submission_v6.docx)
- Fix SI caption filenames to actual uploaded PDFs (reporting_checklist_S1.pdf / _S2.pdf)
- Fix S2 PDF checkboxes (drawn vector boxes instead of missing-glyph ballot)
- Align S2 Study title + cover letter title-change note with manuscript title
</commit_message>
<xml_diff>
--- a/paper_en_submission_v6.docx
+++ b/paper_en_submission_v6.docx
@@ -2096,7 +2096,7 @@
       </w:r>
       <w:proofErr w:type="gramEnd"/>
       <w:r>
-        <w:t xml:space="preserve"> corresponds to the exemption category described in 45 CFR 46.104(d)(4) (see S2 File for the completed PLOS Human Participants Research Checklist).</w:t>
+        <w:t xml:space="preserve"> corresponds to the exemption category described in 45 CFR 46.104(d)(4) (see S2 File for the completed PLOS Human Participants Research Checklist; the IRB exemption determination letter is provided as S3 File).</w:t>
       </w:r>
     </w:p>
     <w:p>
@@ -10133,16 +10133,12 @@
         <w:spacing w:after="0" w:line="480" w:lineRule="auto"/>
       </w:pPr>
       <w:r>
-        <w:t>Recall values are percentages for classes [Awake / Light / Deep]. All values come from the 5-seed mitigation protocol (results/exp101_v2_mitigation/</w:t>
+        <w:t>Recall values are percentages for classes [Awake / Light / Deep]. All values come from the 5-seed mitigation protocol (results/exp101_v2_mitigation/multi_smote_ds.json) and are not directly comparable with the 20-seed Table 4.</w:t>
       </w:r>
       <w:proofErr w:type="spellStart"/>
-      <w:r>
-        <w:t>multi_all_ds.json</w:t>
-      </w:r>
+      <w:r/>
       <w:proofErr w:type="spellEnd"/>
-      <w:r>
-        <w:t>) and are not directly comparable with the 20-seed Table 4.</w:t>
-      </w:r>
+      <w:r/>
     </w:p>
     <w:p>
       <w:pPr>
@@ -12138,12 +12134,10 @@
               <w:spacing w:after="0" w:line="480" w:lineRule="auto"/>
             </w:pPr>
             <w:r>
-              <w:t>results/exp101_v2_mitigation/</w:t>
+              <w:t>results/exp101_v2_mitigation/multi_smote_ds.json</w:t>
             </w:r>
             <w:proofErr w:type="spellStart"/>
-            <w:r>
-              <w:t>multi_all_ds.json</w:t>
-            </w:r>
+            <w:r/>
             <w:proofErr w:type="spellEnd"/>
           </w:p>
         </w:tc>
@@ -12397,22 +12391,6 @@
       <w:r>
         <w:lastRenderedPageBreak/>
         <w:t>participant-level rather than trial-level partitioning (Sections 3.2 and 5.2); full disclosure of degenerate and collapsed cases with no selective omission (Section 4.3); uncertainty quantification through 20-seed confidence intervals and Holm-corrected significance (Sections 3.5 and 4.2); and complete data and code availability (Sections 6.1 and 6.2).</w:t>
-      </w:r>
-    </w:p>
-    <w:p>
-      <w:pPr>
-        <w:spacing w:after="0" w:line="480" w:lineRule="auto"/>
-      </w:pPr>
-      <w:r>
-        <w:t>S2 File. PLOS Human Participants Research Checklist. A completed checklist documenting compliance with the PLOS human-participants research reporting requirements (plos_human_participants_checklist.md).</w:t>
-      </w:r>
-    </w:p>
-    <w:p>
-      <w:pPr>
-        <w:spacing w:after="0" w:line="480" w:lineRule="auto"/>
-      </w:pPr>
-      <w:r>
-        <w:t>S3 File. Institutional Review Board exemption determination. YSUIRB-202607-HR-219-02 exemption letter for the secondary analysis of publicly available EEG datasets.</w:t>
       </w:r>
     </w:p>
     <w:p>
@@ -14227,12 +14205,30 @@
         <w:spacing w:after="0" w:line="480" w:lineRule="auto"/>
       </w:pPr>
       <w:r>
-        <w:t>S1 File. STROBE and TRIPOD+AI reporting checklist. A completed checklist mapping each STROBE and TRIPOD+AI item to the relevant section of this manuscript (reporting_checklist.md).</w:t>
+        <w:t>S1 File. STROBE and TRIPOD+AI reporting checklist. A completed checklist mapping each STROBE and TRIPOD+AI item to the relevant section of this manuscript (reporting_checklist_S1.pdf).</w:t>
+      </w:r>
+    </w:p>
+    <w:p>
+      <w:pPr>
+        <w:spacing w:after="0" w:line="480" w:lineRule="auto"/>
+      </w:pPr>
+      <w:r>
+        <w:t>S2 File. PLOS Human Participants Research Checklist. A completed checklist documenting compliance with the PLOS human-participants research reporting requirements (plos_human_participants_checklist_S2.pdf).</w:t>
+      </w:r>
+    </w:p>
+    <w:p>
+      <w:pPr>
+        <w:spacing w:after="0" w:line="480" w:lineRule="auto"/>
+      </w:pPr>
+      <w:r>
+        <w:t>S3 File. Institutional Review Board exemption determination. YSUIRB-202607-HR-219-02 exemption letter for the secondary analysis of publicly available EEG datasets.</w:t>
       </w:r>
     </w:p>
     <w:sectPr>
+      <w:footerReference w:type="default" r:id="rId9"/>
       <w:pgSz w:w="12240" w:h="15840"/>
       <w:pgMar w:top="1417" w:right="1417" w:bottom="1417" w:left="1417" w:header="720" w:footer="720" w:gutter="0"/>
+      <w:lnNumType w:countBy="1" w:start="1" w:restart="continuous" w:distance="360"/>
       <w:cols w:space="720"/>
       <w:docGrid w:linePitch="360"/>
     </w:sectPr>
@@ -14263,6 +14259,23 @@
     </w:p>
   </w:endnote>
 </w:endnotes>
+</file>
+
+<file path=word/footer1.xml><?xml version="1.0" encoding="utf-8"?>
+<w:ftr xmlns:m="http://schemas.openxmlformats.org/officeDocument/2006/math" xmlns:mc="http://schemas.openxmlformats.org/markup-compatibility/2006" xmlns:mo="http://schemas.microsoft.com/office/mac/office/2008/main" xmlns:mv="urn:schemas-microsoft-com:mac:vml" xmlns:o="urn:schemas-microsoft-com:office:office" xmlns:r="http://schemas.openxmlformats.org/officeDocument/2006/relationships" xmlns:v="urn:schemas-microsoft-com:vml" xmlns:w10="urn:schemas-microsoft-com:office:word" xmlns:w14="http://schemas.microsoft.com/office/word/2010/wordml" xmlns:w="http://schemas.openxmlformats.org/wordprocessingml/2006/main" xmlns:wne="http://schemas.microsoft.com/office/word/2006/wordml" xmlns:wp14="http://schemas.microsoft.com/office/word/2010/wordprocessingDrawing" xmlns:wp="http://schemas.openxmlformats.org/drawingml/2006/wordprocessingDrawing" xmlns:wpc="http://schemas.microsoft.com/office/word/2010/wordprocessingCanvas" xmlns:wpg="http://schemas.microsoft.com/office/word/2010/wordprocessingGroup" xmlns:wpi="http://schemas.microsoft.com/office/word/2010/wordprocessingInk" xmlns:wps="http://schemas.microsoft.com/office/word/2010/wordprocessingShape" mc:Ignorable="w14 wp14">
+  <w:p>
+    <w:pPr>
+      <w:pStyle w:val="Footer"/>
+      <w:jc w:val="center"/>
+    </w:pPr>
+    <w:r>
+      <w:fldChar w:fldCharType="begin"/>
+      <w:instrText xml:space="preserve"> PAGE </w:instrText>
+      <w:fldChar w:fldCharType="separate"/>
+      <w:fldChar w:fldCharType="end"/>
+    </w:r>
+  </w:p>
+</w:ftr>
 </file>
 
 <file path=word/footnotes.xml><?xml version="1.0" encoding="utf-8"?>
@@ -14823,7 +14836,7 @@
     <w:name w:val="Normal"/>
     <w:qFormat/>
     <w:pPr>
-      <w:spacing w:after="120" w:line="360" w:lineRule="auto"/>
+      <w:spacing w:after="120" w:line="480" w:lineRule="auto"/>
     </w:pPr>
     <w:rPr>
       <w:rFonts w:ascii="Times New Roman" w:eastAsia="맑은 고딕" w:hAnsi="Times New Roman"/>

</xml_diff>